<commit_message>
Fix assessment NS count issue, and change all to support updating version number in one file.
</commit_message>
<xml_diff>
--- a/spec/AGCP Normative Statements.docx
+++ b/spec/AGCP Normative Statements.docx
@@ -22869,6 +22869,15 @@
       </w:pPr>
       <w:r>
         <w:t>A conformant implementation SHALL implement the normative behavior defined by this specification and SHALL demonstrate that behavior through objective evidence.</w:t>
+      </w:r>
+    </w:p>
+    <w:p>
+      <w:pPr/>
+      <w:r>
+        <w:rPr>
+          <w:i/>
+        </w:rPr>
+        <w:t>Identifier disposition: NS-17.2-01 is intentionally unassigned. The corresponding Core Section 17.2 obligation duplicates the obligation already identified as NS-2.7-01 in Core Section 2.7. NS-2.7-01 is the authoritative controlled identifier for that normative obligation; no second independently testable Normative Statement is created by the duplicate source-text occurrence.</w:t>
       </w:r>
     </w:p>
     <w:p>

</xml_diff>